<commit_message>
docs: align midterm deck with actual progress and add project-management section
- midterm deck: slide 3 reflects the 8 scenarios already run, slide 7
  explains the 20/20 figure (separate N=2 experiment), slide 8 plan updated
- BAO_CAO.md / .docx: add "Quản trị dự án" (roles, board link placeholder, Git)

Co-Authored-By: Claude Sonnet 5.5 <noreply@anthropic.com>
</commit_message>
<xml_diff>
--- a/docs/BAO_CAO_R05-K15.docx
+++ b/docs/BAO_CAO_R05-K15.docx
@@ -15032,6 +15032,94 @@
       </w:pPr>
       <w:r>
         <w:t xml:space="preserve">Vì race mang tính xác suất, tỉ lệ có thể khác đôi chút trên máy khác. Với các lỗi nhóm báo cáo, cửa sổ race (30–60 ms) rộng hơn nhiều so với độ lệch gửi (≤ 1 ms), nên kết quả FAIL ổn định.</w:t>
+      </w:r>
+    </w:p>
+    <w:p>
+      <w:pPr>
+        <w:pStyle w:val="Heading2"/>
+      </w:pPr>
+      <w:r>
+        <w:t xml:space="preserve">Quản trị dự án</w:t>
+      </w:r>
+    </w:p>
+    <w:p>
+      <w:pPr>
+        <w:pStyle w:val="ListParagraph"/>
+        <w:numPr>
+          <w:ilvl w:val="0"/>
+          <w:numId w:val="2"/>
+        </w:numPr>
+        <w:spacing w:after="60"/>
+      </w:pPr>
+      <w:r>
+        <w:rPr>
+          <w:b/>
+          <w:bCs/>
+        </w:rPr>
+        <w:t xml:space="preserve">Phân vai:</w:t>
+      </w:r>
+      <w:r>
+        <w:t xml:space="preserve"> bảng thành viên ở đầu báo cáo (A – Môi trường &amp; DevOps, B – Phân tích hệ thống, C – Tác giả test, D – Verifier &amp; báo cáo).</w:t>
+      </w:r>
+    </w:p>
+    <w:p>
+      <w:pPr>
+        <w:pStyle w:val="ListParagraph"/>
+        <w:numPr>
+          <w:ilvl w:val="0"/>
+          <w:numId w:val="2"/>
+        </w:numPr>
+        <w:spacing w:after="60"/>
+      </w:pPr>
+      <w:r>
+        <w:rPr>
+          <w:b/>
+          <w:bCs/>
+        </w:rPr>
+        <w:t xml:space="preserve">Board công việc:</w:t>
+      </w:r>
+      <w:r>
+        <w:t xml:space="preserve"> [dán liên kết Trello/Jira/GitHub Projects của nhóm tại đây].</w:t>
+      </w:r>
+    </w:p>
+    <w:p>
+      <w:pPr>
+        <w:pStyle w:val="ListParagraph"/>
+        <w:numPr>
+          <w:ilvl w:val="0"/>
+          <w:numId w:val="2"/>
+        </w:numPr>
+        <w:spacing w:after="60"/>
+      </w:pPr>
+      <w:r>
+        <w:rPr>
+          <w:b/>
+          <w:bCs/>
+        </w:rPr>
+        <w:t xml:space="preserve">Git:</w:t>
+      </w:r>
+      <w:r>
+        <w:t xml:space="preserve"> repo https://github.com/2312741-sudo/kiem_thu_pm; mỗi thành viên commit phần việc của mình để lịch sử thể hiện đóng góp đều đặn.</w:t>
+      </w:r>
+    </w:p>
+    <w:p>
+      <w:pPr>
+        <w:pStyle w:val="ListParagraph"/>
+        <w:numPr>
+          <w:ilvl w:val="0"/>
+          <w:numId w:val="2"/>
+        </w:numPr>
+        <w:spacing w:after="60"/>
+      </w:pPr>
+      <w:r>
+        <w:rPr>
+          <w:b/>
+          <w:bCs/>
+        </w:rPr>
+        <w:t xml:space="preserve">Quy trình:</w:t>
+      </w:r>
+      <w:r>
+        <w:t xml:space="preserve"> Scrum theo Sprint, họp nhóm ngắn đầu và cuối tuần.</w:t>
       </w:r>
     </w:p>
     <w:p>

</xml_diff>

<commit_message>
docs: add team members, board link and card list
- cover slides (midterm and final decks), BAO_CAO.md and .docx now list
  group 13 members and student IDs; generators updated so rebuilds keep them
- add docs/board-cards.md for the GitHub Projects board
- ignore Office lock files

Co-Authored-By: Claude Sonnet 5.5 <noreply@anthropic.com>
</commit_message>
<xml_diff>
--- a/docs/BAO_CAO_R05-K15.docx
+++ b/docs/BAO_CAO_R05-K15.docx
@@ -141,10 +141,10 @@
         </w:tblCellMar>
       </w:tblPr>
       <w:tblGrid>
-        <w:gridCol w:w="1641"/>
-        <w:gridCol w:w="1312"/>
-        <w:gridCol w:w="3774"/>
-        <w:gridCol w:w="2299"/>
+        <w:gridCol w:w="2578"/>
+        <w:gridCol w:w="1146"/>
+        <w:gridCol w:w="3295"/>
+        <w:gridCol w:w="2007"/>
       </w:tblGrid>
       <w:tr>
         <w:trPr>
@@ -152,7 +152,7 @@
         </w:trPr>
         <w:tc>
           <w:tcPr>
-            <w:tcW w:type="dxa" w:w="1641"/>
+            <w:tcW w:type="dxa" w:w="2578"/>
             <w:tcBorders>
               <w:top w:val="single" w:color="BFBFBF" w:sz="4"/>
               <w:left w:val="single" w:color="BFBFBF" w:sz="4"/>
@@ -181,7 +181,7 @@
         </w:tc>
         <w:tc>
           <w:tcPr>
-            <w:tcW w:type="dxa" w:w="1312"/>
+            <w:tcW w:type="dxa" w:w="1146"/>
             <w:tcBorders>
               <w:top w:val="single" w:color="BFBFBF" w:sz="4"/>
               <w:left w:val="single" w:color="BFBFBF" w:sz="4"/>
@@ -210,7 +210,7 @@
         </w:tc>
         <w:tc>
           <w:tcPr>
-            <w:tcW w:type="dxa" w:w="3774"/>
+            <w:tcW w:type="dxa" w:w="3295"/>
             <w:tcBorders>
               <w:top w:val="single" w:color="BFBFBF" w:sz="4"/>
               <w:left w:val="single" w:color="BFBFBF" w:sz="4"/>
@@ -239,7 +239,7 @@
         </w:tc>
         <w:tc>
           <w:tcPr>
-            <w:tcW w:type="dxa" w:w="2299"/>
+            <w:tcW w:type="dxa" w:w="2007"/>
             <w:tcBorders>
               <w:top w:val="single" w:color="BFBFBF" w:sz="4"/>
               <w:left w:val="single" w:color="BFBFBF" w:sz="4"/>
@@ -273,59 +273,59 @@
         </w:trPr>
         <w:tc>
           <w:tcPr>
-            <w:tcW w:type="dxa" w:w="1641"/>
-            <w:tcBorders>
-              <w:top w:val="single" w:color="BFBFBF" w:sz="4"/>
-              <w:left w:val="single" w:color="BFBFBF" w:sz="4"/>
-              <w:bottom w:val="single" w:color="BFBFBF" w:sz="4"/>
-              <w:right w:val="single" w:color="BFBFBF" w:sz="4"/>
-            </w:tcBorders>
-            <w:tcMar>
-              <w:top w:type="dxa" w:w="60"/>
-              <w:left w:type="dxa" w:w="100"/>
-              <w:bottom w:type="dxa" w:w="60"/>
-              <w:right w:type="dxa" w:w="100"/>
-            </w:tcMar>
-          </w:tcPr>
-          <w:p>
-            <w:r>
-              <w:rPr>
-                <w:sz w:val="20"/>
-                <w:szCs w:val="20"/>
-              </w:rPr>
-              <w:t xml:space="preserve">(điền)</w:t>
-            </w:r>
-          </w:p>
-        </w:tc>
-        <w:tc>
-          <w:tcPr>
-            <w:tcW w:type="dxa" w:w="1312"/>
-            <w:tcBorders>
-              <w:top w:val="single" w:color="BFBFBF" w:sz="4"/>
-              <w:left w:val="single" w:color="BFBFBF" w:sz="4"/>
-              <w:bottom w:val="single" w:color="BFBFBF" w:sz="4"/>
-              <w:right w:val="single" w:color="BFBFBF" w:sz="4"/>
-            </w:tcBorders>
-            <w:tcMar>
-              <w:top w:type="dxa" w:w="60"/>
-              <w:left w:type="dxa" w:w="100"/>
-              <w:bottom w:type="dxa" w:w="60"/>
-              <w:right w:type="dxa" w:w="100"/>
-            </w:tcMar>
-          </w:tcPr>
-          <w:p>
-            <w:r>
-              <w:rPr>
-                <w:sz w:val="20"/>
-                <w:szCs w:val="20"/>
-              </w:rPr>
-              <w:t xml:space="preserve">(điền)</w:t>
-            </w:r>
-          </w:p>
-        </w:tc>
-        <w:tc>
-          <w:tcPr>
-            <w:tcW w:type="dxa" w:w="3774"/>
+            <w:tcW w:type="dxa" w:w="2578"/>
+            <w:tcBorders>
+              <w:top w:val="single" w:color="BFBFBF" w:sz="4"/>
+              <w:left w:val="single" w:color="BFBFBF" w:sz="4"/>
+              <w:bottom w:val="single" w:color="BFBFBF" w:sz="4"/>
+              <w:right w:val="single" w:color="BFBFBF" w:sz="4"/>
+            </w:tcBorders>
+            <w:tcMar>
+              <w:top w:type="dxa" w:w="60"/>
+              <w:left w:type="dxa" w:w="100"/>
+              <w:bottom w:type="dxa" w:w="60"/>
+              <w:right w:type="dxa" w:w="100"/>
+            </w:tcMar>
+          </w:tcPr>
+          <w:p>
+            <w:r>
+              <w:rPr>
+                <w:sz w:val="20"/>
+                <w:szCs w:val="20"/>
+              </w:rPr>
+              <w:t xml:space="preserve">Nguyễn Thanh Tâm</w:t>
+            </w:r>
+          </w:p>
+        </w:tc>
+        <w:tc>
+          <w:tcPr>
+            <w:tcW w:type="dxa" w:w="1146"/>
+            <w:tcBorders>
+              <w:top w:val="single" w:color="BFBFBF" w:sz="4"/>
+              <w:left w:val="single" w:color="BFBFBF" w:sz="4"/>
+              <w:bottom w:val="single" w:color="BFBFBF" w:sz="4"/>
+              <w:right w:val="single" w:color="BFBFBF" w:sz="4"/>
+            </w:tcBorders>
+            <w:tcMar>
+              <w:top w:type="dxa" w:w="60"/>
+              <w:left w:type="dxa" w:w="100"/>
+              <w:bottom w:type="dxa" w:w="60"/>
+              <w:right w:type="dxa" w:w="100"/>
+            </w:tcMar>
+          </w:tcPr>
+          <w:p>
+            <w:r>
+              <w:rPr>
+                <w:sz w:val="20"/>
+                <w:szCs w:val="20"/>
+              </w:rPr>
+              <w:t xml:space="preserve">2312741</w:t>
+            </w:r>
+          </w:p>
+        </w:tc>
+        <w:tc>
+          <w:tcPr>
+            <w:tcW w:type="dxa" w:w="3295"/>
             <w:tcBorders>
               <w:top w:val="single" w:color="BFBFBF" w:sz="4"/>
               <w:left w:val="single" w:color="BFBFBF" w:sz="4"/>
@@ -351,7 +351,7 @@
         </w:tc>
         <w:tc>
           <w:tcPr>
-            <w:tcW w:type="dxa" w:w="2299"/>
+            <w:tcW w:type="dxa" w:w="2007"/>
             <w:tcBorders>
               <w:top w:val="single" w:color="BFBFBF" w:sz="4"/>
               <w:left w:val="single" w:color="BFBFBF" w:sz="4"/>
@@ -382,59 +382,59 @@
         </w:trPr>
         <w:tc>
           <w:tcPr>
-            <w:tcW w:type="dxa" w:w="1641"/>
-            <w:tcBorders>
-              <w:top w:val="single" w:color="BFBFBF" w:sz="4"/>
-              <w:left w:val="single" w:color="BFBFBF" w:sz="4"/>
-              <w:bottom w:val="single" w:color="BFBFBF" w:sz="4"/>
-              <w:right w:val="single" w:color="BFBFBF" w:sz="4"/>
-            </w:tcBorders>
-            <w:tcMar>
-              <w:top w:type="dxa" w:w="60"/>
-              <w:left w:type="dxa" w:w="100"/>
-              <w:bottom w:type="dxa" w:w="60"/>
-              <w:right w:type="dxa" w:w="100"/>
-            </w:tcMar>
-          </w:tcPr>
-          <w:p>
-            <w:r>
-              <w:rPr>
-                <w:sz w:val="20"/>
-                <w:szCs w:val="20"/>
-              </w:rPr>
-              <w:t xml:space="preserve">(điền)</w:t>
-            </w:r>
-          </w:p>
-        </w:tc>
-        <w:tc>
-          <w:tcPr>
-            <w:tcW w:type="dxa" w:w="1312"/>
-            <w:tcBorders>
-              <w:top w:val="single" w:color="BFBFBF" w:sz="4"/>
-              <w:left w:val="single" w:color="BFBFBF" w:sz="4"/>
-              <w:bottom w:val="single" w:color="BFBFBF" w:sz="4"/>
-              <w:right w:val="single" w:color="BFBFBF" w:sz="4"/>
-            </w:tcBorders>
-            <w:tcMar>
-              <w:top w:type="dxa" w:w="60"/>
-              <w:left w:type="dxa" w:w="100"/>
-              <w:bottom w:type="dxa" w:w="60"/>
-              <w:right w:type="dxa" w:w="100"/>
-            </w:tcMar>
-          </w:tcPr>
-          <w:p>
-            <w:r>
-              <w:rPr>
-                <w:sz w:val="20"/>
-                <w:szCs w:val="20"/>
-              </w:rPr>
-              <w:t xml:space="preserve">(điền)</w:t>
-            </w:r>
-          </w:p>
-        </w:tc>
-        <w:tc>
-          <w:tcPr>
-            <w:tcW w:type="dxa" w:w="3774"/>
+            <w:tcW w:type="dxa" w:w="2578"/>
+            <w:tcBorders>
+              <w:top w:val="single" w:color="BFBFBF" w:sz="4"/>
+              <w:left w:val="single" w:color="BFBFBF" w:sz="4"/>
+              <w:bottom w:val="single" w:color="BFBFBF" w:sz="4"/>
+              <w:right w:val="single" w:color="BFBFBF" w:sz="4"/>
+            </w:tcBorders>
+            <w:tcMar>
+              <w:top w:type="dxa" w:w="60"/>
+              <w:left w:type="dxa" w:w="100"/>
+              <w:bottom w:type="dxa" w:w="60"/>
+              <w:right w:type="dxa" w:w="100"/>
+            </w:tcMar>
+          </w:tcPr>
+          <w:p>
+            <w:r>
+              <w:rPr>
+                <w:sz w:val="20"/>
+                <w:szCs w:val="20"/>
+              </w:rPr>
+              <w:t xml:space="preserve">Võ Công Vinh</w:t>
+            </w:r>
+          </w:p>
+        </w:tc>
+        <w:tc>
+          <w:tcPr>
+            <w:tcW w:type="dxa" w:w="1146"/>
+            <w:tcBorders>
+              <w:top w:val="single" w:color="BFBFBF" w:sz="4"/>
+              <w:left w:val="single" w:color="BFBFBF" w:sz="4"/>
+              <w:bottom w:val="single" w:color="BFBFBF" w:sz="4"/>
+              <w:right w:val="single" w:color="BFBFBF" w:sz="4"/>
+            </w:tcBorders>
+            <w:tcMar>
+              <w:top w:type="dxa" w:w="60"/>
+              <w:left w:type="dxa" w:w="100"/>
+              <w:bottom w:type="dxa" w:w="60"/>
+              <w:right w:type="dxa" w:w="100"/>
+            </w:tcMar>
+          </w:tcPr>
+          <w:p>
+            <w:r>
+              <w:rPr>
+                <w:sz w:val="20"/>
+                <w:szCs w:val="20"/>
+              </w:rPr>
+              <w:t xml:space="preserve">2312800</w:t>
+            </w:r>
+          </w:p>
+        </w:tc>
+        <w:tc>
+          <w:tcPr>
+            <w:tcW w:type="dxa" w:w="3295"/>
             <w:tcBorders>
               <w:top w:val="single" w:color="BFBFBF" w:sz="4"/>
               <w:left w:val="single" w:color="BFBFBF" w:sz="4"/>
@@ -460,7 +460,7 @@
         </w:tc>
         <w:tc>
           <w:tcPr>
-            <w:tcW w:type="dxa" w:w="2299"/>
+            <w:tcW w:type="dxa" w:w="2007"/>
             <w:tcBorders>
               <w:top w:val="single" w:color="BFBFBF" w:sz="4"/>
               <w:left w:val="single" w:color="BFBFBF" w:sz="4"/>
@@ -491,59 +491,59 @@
         </w:trPr>
         <w:tc>
           <w:tcPr>
-            <w:tcW w:type="dxa" w:w="1641"/>
-            <w:tcBorders>
-              <w:top w:val="single" w:color="BFBFBF" w:sz="4"/>
-              <w:left w:val="single" w:color="BFBFBF" w:sz="4"/>
-              <w:bottom w:val="single" w:color="BFBFBF" w:sz="4"/>
-              <w:right w:val="single" w:color="BFBFBF" w:sz="4"/>
-            </w:tcBorders>
-            <w:tcMar>
-              <w:top w:type="dxa" w:w="60"/>
-              <w:left w:type="dxa" w:w="100"/>
-              <w:bottom w:type="dxa" w:w="60"/>
-              <w:right w:type="dxa" w:w="100"/>
-            </w:tcMar>
-          </w:tcPr>
-          <w:p>
-            <w:r>
-              <w:rPr>
-                <w:sz w:val="20"/>
-                <w:szCs w:val="20"/>
-              </w:rPr>
-              <w:t xml:space="preserve">(điền)</w:t>
-            </w:r>
-          </w:p>
-        </w:tc>
-        <w:tc>
-          <w:tcPr>
-            <w:tcW w:type="dxa" w:w="1312"/>
-            <w:tcBorders>
-              <w:top w:val="single" w:color="BFBFBF" w:sz="4"/>
-              <w:left w:val="single" w:color="BFBFBF" w:sz="4"/>
-              <w:bottom w:val="single" w:color="BFBFBF" w:sz="4"/>
-              <w:right w:val="single" w:color="BFBFBF" w:sz="4"/>
-            </w:tcBorders>
-            <w:tcMar>
-              <w:top w:type="dxa" w:w="60"/>
-              <w:left w:type="dxa" w:w="100"/>
-              <w:bottom w:type="dxa" w:w="60"/>
-              <w:right w:type="dxa" w:w="100"/>
-            </w:tcMar>
-          </w:tcPr>
-          <w:p>
-            <w:r>
-              <w:rPr>
-                <w:sz w:val="20"/>
-                <w:szCs w:val="20"/>
-              </w:rPr>
-              <w:t xml:space="preserve">(điền)</w:t>
-            </w:r>
-          </w:p>
-        </w:tc>
-        <w:tc>
-          <w:tcPr>
-            <w:tcW w:type="dxa" w:w="3774"/>
+            <w:tcW w:type="dxa" w:w="2578"/>
+            <w:tcBorders>
+              <w:top w:val="single" w:color="BFBFBF" w:sz="4"/>
+              <w:left w:val="single" w:color="BFBFBF" w:sz="4"/>
+              <w:bottom w:val="single" w:color="BFBFBF" w:sz="4"/>
+              <w:right w:val="single" w:color="BFBFBF" w:sz="4"/>
+            </w:tcBorders>
+            <w:tcMar>
+              <w:top w:type="dxa" w:w="60"/>
+              <w:left w:type="dxa" w:w="100"/>
+              <w:bottom w:type="dxa" w:w="60"/>
+              <w:right w:type="dxa" w:w="100"/>
+            </w:tcMar>
+          </w:tcPr>
+          <w:p>
+            <w:r>
+              <w:rPr>
+                <w:sz w:val="20"/>
+                <w:szCs w:val="20"/>
+              </w:rPr>
+              <w:t xml:space="preserve">Nguyễn Đức Tín</w:t>
+            </w:r>
+          </w:p>
+        </w:tc>
+        <w:tc>
+          <w:tcPr>
+            <w:tcW w:type="dxa" w:w="1146"/>
+            <w:tcBorders>
+              <w:top w:val="single" w:color="BFBFBF" w:sz="4"/>
+              <w:left w:val="single" w:color="BFBFBF" w:sz="4"/>
+              <w:bottom w:val="single" w:color="BFBFBF" w:sz="4"/>
+              <w:right w:val="single" w:color="BFBFBF" w:sz="4"/>
+            </w:tcBorders>
+            <w:tcMar>
+              <w:top w:type="dxa" w:w="60"/>
+              <w:left w:type="dxa" w:w="100"/>
+              <w:bottom w:type="dxa" w:w="60"/>
+              <w:right w:type="dxa" w:w="100"/>
+            </w:tcMar>
+          </w:tcPr>
+          <w:p>
+            <w:r>
+              <w:rPr>
+                <w:sz w:val="20"/>
+                <w:szCs w:val="20"/>
+              </w:rPr>
+              <w:t xml:space="preserve">2312774</w:t>
+            </w:r>
+          </w:p>
+        </w:tc>
+        <w:tc>
+          <w:tcPr>
+            <w:tcW w:type="dxa" w:w="3295"/>
             <w:tcBorders>
               <w:top w:val="single" w:color="BFBFBF" w:sz="4"/>
               <w:left w:val="single" w:color="BFBFBF" w:sz="4"/>
@@ -569,7 +569,7 @@
         </w:tc>
         <w:tc>
           <w:tcPr>
-            <w:tcW w:type="dxa" w:w="2299"/>
+            <w:tcW w:type="dxa" w:w="2007"/>
             <w:tcBorders>
               <w:top w:val="single" w:color="BFBFBF" w:sz="4"/>
               <w:left w:val="single" w:color="BFBFBF" w:sz="4"/>
@@ -600,59 +600,59 @@
         </w:trPr>
         <w:tc>
           <w:tcPr>
-            <w:tcW w:type="dxa" w:w="1641"/>
-            <w:tcBorders>
-              <w:top w:val="single" w:color="BFBFBF" w:sz="4"/>
-              <w:left w:val="single" w:color="BFBFBF" w:sz="4"/>
-              <w:bottom w:val="single" w:color="BFBFBF" w:sz="4"/>
-              <w:right w:val="single" w:color="BFBFBF" w:sz="4"/>
-            </w:tcBorders>
-            <w:tcMar>
-              <w:top w:type="dxa" w:w="60"/>
-              <w:left w:type="dxa" w:w="100"/>
-              <w:bottom w:type="dxa" w:w="60"/>
-              <w:right w:type="dxa" w:w="100"/>
-            </w:tcMar>
-          </w:tcPr>
-          <w:p>
-            <w:r>
-              <w:rPr>
-                <w:sz w:val="20"/>
-                <w:szCs w:val="20"/>
-              </w:rPr>
-              <w:t xml:space="preserve">(điền)</w:t>
-            </w:r>
-          </w:p>
-        </w:tc>
-        <w:tc>
-          <w:tcPr>
-            <w:tcW w:type="dxa" w:w="1312"/>
-            <w:tcBorders>
-              <w:top w:val="single" w:color="BFBFBF" w:sz="4"/>
-              <w:left w:val="single" w:color="BFBFBF" w:sz="4"/>
-              <w:bottom w:val="single" w:color="BFBFBF" w:sz="4"/>
-              <w:right w:val="single" w:color="BFBFBF" w:sz="4"/>
-            </w:tcBorders>
-            <w:tcMar>
-              <w:top w:type="dxa" w:w="60"/>
-              <w:left w:type="dxa" w:w="100"/>
-              <w:bottom w:type="dxa" w:w="60"/>
-              <w:right w:type="dxa" w:w="100"/>
-            </w:tcMar>
-          </w:tcPr>
-          <w:p>
-            <w:r>
-              <w:rPr>
-                <w:sz w:val="20"/>
-                <w:szCs w:val="20"/>
-              </w:rPr>
-              <w:t xml:space="preserve">(điền)</w:t>
-            </w:r>
-          </w:p>
-        </w:tc>
-        <w:tc>
-          <w:tcPr>
-            <w:tcW w:type="dxa" w:w="3774"/>
+            <w:tcW w:type="dxa" w:w="2578"/>
+            <w:tcBorders>
+              <w:top w:val="single" w:color="BFBFBF" w:sz="4"/>
+              <w:left w:val="single" w:color="BFBFBF" w:sz="4"/>
+              <w:bottom w:val="single" w:color="BFBFBF" w:sz="4"/>
+              <w:right w:val="single" w:color="BFBFBF" w:sz="4"/>
+            </w:tcBorders>
+            <w:tcMar>
+              <w:top w:type="dxa" w:w="60"/>
+              <w:left w:type="dxa" w:w="100"/>
+              <w:bottom w:type="dxa" w:w="60"/>
+              <w:right w:type="dxa" w:w="100"/>
+            </w:tcMar>
+          </w:tcPr>
+          <w:p>
+            <w:r>
+              <w:rPr>
+                <w:sz w:val="20"/>
+                <w:szCs w:val="20"/>
+              </w:rPr>
+              <w:t xml:space="preserve">Ngô Quốc Trường Vĩ</w:t>
+            </w:r>
+          </w:p>
+        </w:tc>
+        <w:tc>
+          <w:tcPr>
+            <w:tcW w:type="dxa" w:w="1146"/>
+            <w:tcBorders>
+              <w:top w:val="single" w:color="BFBFBF" w:sz="4"/>
+              <w:left w:val="single" w:color="BFBFBF" w:sz="4"/>
+              <w:bottom w:val="single" w:color="BFBFBF" w:sz="4"/>
+              <w:right w:val="single" w:color="BFBFBF" w:sz="4"/>
+            </w:tcBorders>
+            <w:tcMar>
+              <w:top w:type="dxa" w:w="60"/>
+              <w:left w:type="dxa" w:w="100"/>
+              <w:bottom w:type="dxa" w:w="60"/>
+              <w:right w:type="dxa" w:w="100"/>
+            </w:tcMar>
+          </w:tcPr>
+          <w:p>
+            <w:r>
+              <w:rPr>
+                <w:sz w:val="20"/>
+                <w:szCs w:val="20"/>
+              </w:rPr>
+              <w:t xml:space="preserve">2312796</w:t>
+            </w:r>
+          </w:p>
+        </w:tc>
+        <w:tc>
+          <w:tcPr>
+            <w:tcW w:type="dxa" w:w="3295"/>
             <w:tcBorders>
               <w:top w:val="single" w:color="BFBFBF" w:sz="4"/>
               <w:left w:val="single" w:color="BFBFBF" w:sz="4"/>
@@ -678,7 +678,7 @@
         </w:tc>
         <w:tc>
           <w:tcPr>
-            <w:tcW w:type="dxa" w:w="2299"/>
+            <w:tcW w:type="dxa" w:w="2007"/>
             <w:tcBorders>
               <w:top w:val="single" w:color="BFBFBF" w:sz="4"/>
               <w:left w:val="single" w:color="BFBFBF" w:sz="4"/>
@@ -15079,7 +15079,7 @@
         <w:t xml:space="preserve">Board công việc:</w:t>
       </w:r>
       <w:r>
-        <w:t xml:space="preserve"> [dán liên kết Trello/Jira/GitHub Projects của nhóm tại đây].</w:t>
+        <w:t xml:space="preserve"> GitHub Projects tại https://github.com/users/2312741-sudo/projects/1 (danh sách thẻ: docs/board-cards.md).</w:t>
       </w:r>
     </w:p>
     <w:p>

</xml_diff>

<commit_message>
docs: add GitHub Projects board evidence to report and midterm deck
- docs/evidence/board.png: screenshot of the board (7 Todo, 1 In Progress, 10 Done)
- BAO_CAO.md / .docx: embed the board screenshot in the project-management section
- build-docx.cjs: support image lines in markdown
- midterm deck slide 3: board row now points to the screenshot

Co-Authored-By: Claude Sonnet 5.5 <noreply@anthropic.com>
</commit_message>
<xml_diff>
--- a/docs/BAO_CAO_R05-K15.docx
+++ b/docs/BAO_CAO_R05-K15.docx
@@ -15120,6 +15120,67 @@
       </w:r>
       <w:r>
         <w:t xml:space="preserve"> Scrum theo Sprint, họp nhóm ngắn đầu và cuối tuần.</w:t>
+      </w:r>
+    </w:p>
+    <w:p>
+      <w:pPr>
+        <w:spacing w:after="60" w:before="120"/>
+        <w:jc w:val="center"/>
+      </w:pPr>
+      <w:r>
+        <w:drawing>
+          <wp:inline distT="0" distB="0" distL="0" distR="0">
+            <wp:extent cx="5715000" cy="2886075"/>
+            <wp:effectExtent t="0" r="0" b="0" l="0"/>
+            <wp:docPr id="1" name="board" descr="Board GitHub Projects R05-K15 – Kế hoạch: 7 thẻ Todo, 1 In Progress, 10 Done" title="Board GitHub Projects R05-K15 – Kế hoạch: 7 thẻ Todo, 1 In Progress, 10 Done"/>
+            <wp:cNvGraphicFramePr>
+              <a:graphicFrameLocks xmlns:a="http://schemas.openxmlformats.org/drawingml/2006/main" noChangeAspect="1"/>
+            </wp:cNvGraphicFramePr>
+            <a:graphic xmlns:a="http://schemas.openxmlformats.org/drawingml/2006/main">
+              <a:graphicData uri="http://schemas.openxmlformats.org/drawingml/2006/picture">
+                <pic:pic xmlns:pic="http://schemas.openxmlformats.org/drawingml/2006/picture">
+                  <pic:nvPicPr>
+                    <pic:cNvPr id="0" name="" descr=""/>
+                    <pic:cNvPicPr>
+                      <a:picLocks noChangeAspect="1" noChangeArrowheads="1"/>
+                    </pic:cNvPicPr>
+                  </pic:nvPicPr>
+                  <pic:blipFill>
+                    <a:blip r:embed="rId8" cstate="none"/>
+                    <a:srcRect/>
+                    <a:stretch>
+                      <a:fillRect/>
+                    </a:stretch>
+                  </pic:blipFill>
+                  <pic:spPr bwMode="auto">
+                    <a:xfrm>
+                      <a:off x="0" y="0"/>
+                      <a:ext cx="5715000" cy="2886075"/>
+                    </a:xfrm>
+                    <a:prstGeom prst="rect">
+                      <a:avLst/>
+                    </a:prstGeom>
+                  </pic:spPr>
+                </pic:pic>
+              </a:graphicData>
+            </a:graphic>
+          </wp:inline>
+        </w:drawing>
+      </w:r>
+    </w:p>
+    <w:p>
+      <w:pPr>
+        <w:spacing w:after="160"/>
+        <w:jc w:val="center"/>
+      </w:pPr>
+      <w:r>
+        <w:rPr>
+          <w:i/>
+          <w:iCs/>
+          <w:sz w:val="20"/>
+          <w:szCs w:val="20"/>
+        </w:rPr>
+        <w:t xml:space="preserve">Board GitHub Projects R05-K15 – Kế hoạch: 7 thẻ Todo, 1 In Progress, 10 Done</w:t>
       </w:r>
     </w:p>
     <w:p>

</xml_diff>